<commit_message>
feat: add person/company toggle and put buttons on one line
- smlouva.docx: make IČ/DIČ labels dynamic ({ico_udaj}/{dic_udaj})
- smlouva template-data: add typ field (osoba/firma), generate
  correct identifier label per type
- both forms: TypToggle component switches fields between
  fyzická osoba (rodné číslo) and právnická osoba (IČO + DIČ)
- buttons rendered side-by-side with flex-row

Co-Authored-By: Claude Sonnet 4.6 <noreply@anthropic.com>
</commit_message>
<xml_diff>
--- a/public/smlouva.docx
+++ b/public/smlouva.docx
@@ -250,7 +250,7 @@
           <w:szCs w:val="17"/>
           <w:shd w:val="clear" w:color="auto" w:fill="FFFFFF"/>
         </w:rPr>
-        <w:t xml:space="preserve">IČ: {ico}</w:t>
+        <w:t>{ico_udaj}</w:t>
       </w:r>
     </w:p>
     <w:p>
@@ -275,7 +275,7 @@
           <w:szCs w:val="17"/>
           <w:shd w:val="clear" w:color="auto" w:fill="FFFFFF"/>
         </w:rPr>
-        <w:t xml:space="preserve">DIČ: {dic}</w:t>
+        <w:t>{dic_udaj}</w:t>
       </w:r>
     </w:p>
     <w:p>

</xml_diff>